<commit_message>
Ruth 2nd in-depth re-review: 5 EN restorations (asymmetric KO-had-it gaps), docx rebuild, doc reupload + title 'Final' removed
- EN: ch1 [1-2] 'all Ephrathites from Bethlehem in Judah' (family-wide scope fix);
  ch2 [2] 'Ruth, the Moabite foreigner'; ch2 [3-4] 'her father-in-law Elimelech's relative';
  ch2 [6-7] 'the Moabite girl'; ch2 [21] 'Ruth the Moabite'
- KO already held all five — EN-only restorations, no KO changes
- Gates: validate PASS, build VERIFY_DROPPED=0 (74 rows), pairing OK,
  reupload.py BOOK_TABLES += Ruth, Google Doc 14tmrTTb1rGX0gatBv5khy4tBvEEopS9uD5m3kcEd_LY
  tables 4/4 export-back VERIFIED, title '룻기 (Ruth): MSG + Teen EN + KO' (Final removed)
- audit_Ruth.md section 7 documents the 11 checker false positives and 1st-audit keep-decisions
</commit_message>
<xml_diff>
--- a/gdocs_build/Ruth.docx
+++ b/gdocs_build/Ruth.docx
@@ -124,7 +124,7 @@
               <w:rPr>
                 <w:sz w:val="18"/>
               </w:rPr>
-              <w:t>So, way back when judges were in charge of Israel, things got real tough. There was this massive famine, like, no food anywhere. This guy named Elimelech—an Ephrathite from Bethlehem in Judah—his wife Naomi, and their two sons, Mahlon and Kilion, decided to dip. They packed up and moved to a country called Moab to find a better life.</w:t>
+              <w:t>So, way back when judges were in charge of Israel, things got real tough. There was this massive famine, like, no food anywhere. This guy named Elimelech, his wife Naomi, and their two sons, Mahlon and Kilion—all Ephrathites from Bethlehem in Judah—decided to dip. They packed up and moved to a country called Moab to find a better life.</w:t>
             </w:r>
           </w:p>
         </w:tc>
@@ -1201,7 +1201,7 @@
               <w:rPr>
                 <w:sz w:val="18"/>
               </w:rPr>
-              <w:t>One day, Ruth, who was still kinda the new girl from Moab, told Naomi, 'Hey, I'm gonna go out and try to find some work. I'll just follow behind the harvest crews and pick up the leftovers. Hopefully, someone will be cool about it.'</w:t>
+              <w:t>One day, Ruth, the Moabite foreigner who was still kinda the new girl in town, told Naomi, 'Hey, I'm gonna go out and try to find some work. I'll just follow behind the harvest crews and pick up the leftovers. Hopefully, someone will be cool about it.'</w:t>
             </w:r>
           </w:p>
         </w:tc>
@@ -1343,7 +1343,7 @@
               <w:rPr>
                 <w:sz w:val="18"/>
               </w:rPr>
-              <w:t>So Ruth headed out. She started picking up leftover grain in a random field, trailing the main crew. And guess what? She just happened to end up in the part of the field that belonged to Boaz, the rich relative. A bit later, Boaz himself showed up from town and said to his workers, 'Yo, God be with you!' And they were all like, 'And with you too, boss!'</w:t>
+              <w:t>So Ruth headed out. She started picking up leftover grain in a random field, trailing the main crew. And guess what? She just happened to end up in the part of the field that belonged to Boaz, her father-in-law Elimelech's relative. A bit later, Boaz himself showed up from town and said to his workers, 'Yo, God be with you!' And they were all like, 'And with you too, boss!'</w:t>
             </w:r>
           </w:p>
         </w:tc>
@@ -1485,7 +1485,7 @@
               <w:rPr>
                 <w:sz w:val="18"/>
               </w:rPr>
-              <w:t>The foreman was like, 'Oh, that's the girl from Moab who came back with Naomi. She was super polite and asked if she could just follow the crew and gather the leftovers. And lowkey, she's been grinding nonstop since this morning.'</w:t>
+              <w:t>The foreman was like, 'Oh, that's the Moabite girl who came back with Naomi. She was super polite and asked if she could just follow the crew and gather the leftovers. And lowkey, she's been grinding nonstop since this morning.'</w:t>
             </w:r>
           </w:p>
         </w:tc>
@@ -2432,7 +2432,7 @@
               <w:rPr>
                 <w:sz w:val="18"/>
               </w:rPr>
-              <w:t>Ruth was like, 'Get this—he also told me to stick with his workers until the whole harvest is done.'</w:t>
+              <w:t>Ruth the Moabite was like, 'Get this—he also told me to stick with his workers until the whole harvest is done.'</w:t>
             </w:r>
           </w:p>
         </w:tc>

</xml_diff>

<commit_message>
Ruth 배지 정밀화 (OT 전수조사): ch3 P13 '16-17'→'17', ch4 족보 '18-22'×10→절별 분리 (EN+KO). 독스 4/4 export-back OK.
</commit_message>
<xml_diff>
--- a/gdocs_build/Ruth.docx
+++ b/gdocs_build/Ruth.docx
@@ -3628,7 +3628,7 @@
                 <w:b/>
                 <w:sz w:val="16"/>
               </w:rPr>
-              <w:t>16-17</w:t>
+              <w:t>17</w:t>
             </w:r>
           </w:p>
           <w:p>
@@ -3651,7 +3651,7 @@
                 <w:b/>
                 <w:sz w:val="16"/>
               </w:rPr>
-              <w:t>16-17</w:t>
+              <w:t>17</w:t>
             </w:r>
           </w:p>
           <w:p>
@@ -3674,7 +3674,7 @@
                 <w:b/>
                 <w:sz w:val="16"/>
               </w:rPr>
-              <w:t>16-17</w:t>
+              <w:t>17</w:t>
             </w:r>
           </w:p>
           <w:p>
@@ -4918,7 +4918,7 @@
                 <w:b/>
                 <w:sz w:val="16"/>
               </w:rPr>
-              <w:t>18-22</w:t>
+              <w:t>18</w:t>
             </w:r>
           </w:p>
           <w:p>
@@ -4957,7 +4957,7 @@
                 <w:b/>
                 <w:sz w:val="16"/>
               </w:rPr>
-              <w:t>18-22</w:t>
+              <w:t>18</w:t>
             </w:r>
           </w:p>
           <w:p>
@@ -4980,7 +4980,7 @@
                 <w:b/>
                 <w:sz w:val="16"/>
               </w:rPr>
-              <w:t>18-22</w:t>
+              <w:t>18</w:t>
             </w:r>
           </w:p>
           <w:p>
@@ -5005,7 +5005,7 @@
                 <w:b/>
                 <w:sz w:val="16"/>
               </w:rPr>
-              <w:t>18-22</w:t>
+              <w:t>18</w:t>
             </w:r>
           </w:p>
           <w:p>
@@ -5028,7 +5028,7 @@
                 <w:b/>
                 <w:sz w:val="16"/>
               </w:rPr>
-              <w:t>18-22</w:t>
+              <w:t>18</w:t>
             </w:r>
           </w:p>
           <w:p>
@@ -5051,7 +5051,7 @@
                 <w:b/>
                 <w:sz w:val="16"/>
               </w:rPr>
-              <w:t>18-22</w:t>
+              <w:t>18</w:t>
             </w:r>
           </w:p>
           <w:p>
@@ -5076,7 +5076,7 @@
                 <w:b/>
                 <w:sz w:val="16"/>
               </w:rPr>
-              <w:t>18-22</w:t>
+              <w:t>19</w:t>
             </w:r>
           </w:p>
           <w:p>
@@ -5099,7 +5099,7 @@
                 <w:b/>
                 <w:sz w:val="16"/>
               </w:rPr>
-              <w:t>18-22</w:t>
+              <w:t>19</w:t>
             </w:r>
           </w:p>
           <w:p>
@@ -5122,7 +5122,7 @@
                 <w:b/>
                 <w:sz w:val="16"/>
               </w:rPr>
-              <w:t>18-22</w:t>
+              <w:t>19</w:t>
             </w:r>
           </w:p>
           <w:p>
@@ -5147,7 +5147,7 @@
                 <w:b/>
                 <w:sz w:val="16"/>
               </w:rPr>
-              <w:t>18-22</w:t>
+              <w:t>19</w:t>
             </w:r>
           </w:p>
           <w:p>
@@ -5170,7 +5170,7 @@
                 <w:b/>
                 <w:sz w:val="16"/>
               </w:rPr>
-              <w:t>18-22</w:t>
+              <w:t>19</w:t>
             </w:r>
           </w:p>
           <w:p>
@@ -5193,7 +5193,7 @@
                 <w:b/>
                 <w:sz w:val="16"/>
               </w:rPr>
-              <w:t>18-22</w:t>
+              <w:t>19</w:t>
             </w:r>
           </w:p>
           <w:p>
@@ -5218,7 +5218,7 @@
                 <w:b/>
                 <w:sz w:val="16"/>
               </w:rPr>
-              <w:t>18-22</w:t>
+              <w:t>20</w:t>
             </w:r>
           </w:p>
           <w:p>
@@ -5241,7 +5241,7 @@
                 <w:b/>
                 <w:sz w:val="16"/>
               </w:rPr>
-              <w:t>18-22</w:t>
+              <w:t>20</w:t>
             </w:r>
           </w:p>
           <w:p>
@@ -5264,7 +5264,7 @@
                 <w:b/>
                 <w:sz w:val="16"/>
               </w:rPr>
-              <w:t>18-22</w:t>
+              <w:t>20</w:t>
             </w:r>
           </w:p>
           <w:p>
@@ -5289,7 +5289,7 @@
                 <w:b/>
                 <w:sz w:val="16"/>
               </w:rPr>
-              <w:t>18-22</w:t>
+              <w:t>20</w:t>
             </w:r>
           </w:p>
           <w:p>
@@ -5312,7 +5312,7 @@
                 <w:b/>
                 <w:sz w:val="16"/>
               </w:rPr>
-              <w:t>18-22</w:t>
+              <w:t>20</w:t>
             </w:r>
           </w:p>
           <w:p>
@@ -5335,7 +5335,7 @@
                 <w:b/>
                 <w:sz w:val="16"/>
               </w:rPr>
-              <w:t>18-22</w:t>
+              <w:t>20</w:t>
             </w:r>
           </w:p>
           <w:p>
@@ -5360,7 +5360,7 @@
                 <w:b/>
                 <w:sz w:val="16"/>
               </w:rPr>
-              <w:t>18-22</w:t>
+              <w:t>21</w:t>
             </w:r>
           </w:p>
           <w:p>
@@ -5383,7 +5383,7 @@
                 <w:b/>
                 <w:sz w:val="16"/>
               </w:rPr>
-              <w:t>18-22</w:t>
+              <w:t>21</w:t>
             </w:r>
           </w:p>
           <w:p>
@@ -5406,7 +5406,7 @@
                 <w:b/>
                 <w:sz w:val="16"/>
               </w:rPr>
-              <w:t>18-22</w:t>
+              <w:t>21</w:t>
             </w:r>
           </w:p>
           <w:p>
@@ -5431,7 +5431,7 @@
                 <w:b/>
                 <w:sz w:val="16"/>
               </w:rPr>
-              <w:t>18-22</w:t>
+              <w:t>21</w:t>
             </w:r>
           </w:p>
           <w:p>
@@ -5454,7 +5454,7 @@
                 <w:b/>
                 <w:sz w:val="16"/>
               </w:rPr>
-              <w:t>18-22</w:t>
+              <w:t>21</w:t>
             </w:r>
           </w:p>
           <w:p>
@@ -5477,7 +5477,7 @@
                 <w:b/>
                 <w:sz w:val="16"/>
               </w:rPr>
-              <w:t>18-22</w:t>
+              <w:t>21</w:t>
             </w:r>
           </w:p>
           <w:p>
@@ -5502,7 +5502,7 @@
                 <w:b/>
                 <w:sz w:val="16"/>
               </w:rPr>
-              <w:t>18-22</w:t>
+              <w:t>22</w:t>
             </w:r>
           </w:p>
           <w:p>
@@ -5525,7 +5525,7 @@
                 <w:b/>
                 <w:sz w:val="16"/>
               </w:rPr>
-              <w:t>18-22</w:t>
+              <w:t>22</w:t>
             </w:r>
           </w:p>
           <w:p>
@@ -5548,7 +5548,7 @@
                 <w:b/>
                 <w:sz w:val="16"/>
               </w:rPr>
-              <w:t>18-22</w:t>
+              <w:t>22</w:t>
             </w:r>
           </w:p>
           <w:p>
@@ -5573,7 +5573,7 @@
                 <w:b/>
                 <w:sz w:val="16"/>
               </w:rPr>
-              <w:t>18-22</w:t>
+              <w:t>22</w:t>
             </w:r>
           </w:p>
           <w:p>
@@ -5596,7 +5596,7 @@
                 <w:b/>
                 <w:sz w:val="16"/>
               </w:rPr>
-              <w:t>18-22</w:t>
+              <w:t>22</w:t>
             </w:r>
           </w:p>
           <w:p>
@@ -5619,7 +5619,7 @@
                 <w:b/>
                 <w:sz w:val="16"/>
               </w:rPr>
-              <w:t>18-22</w:t>
+              <w:t>22</w:t>
             </w:r>
           </w:p>
           <w:p>

</xml_diff>